<commit_message>
update nội dung file A
</commit_message>
<xml_diff>
--- a/A1.docx
+++ b/A1.docx
@@ -9,6 +9,47 @@
       <w:r>
         <w:t>A1</w:t>
       </w:r>
+      <w:proofErr w:type="gramStart"/>
+      <w:r>
+        <w:t xml:space="preserve">_  </w:t>
+      </w:r>
+      <w:proofErr w:type="spellStart"/>
+      <w:r>
+        <w:rPr>
+          <w:highlight w:val="yellow"/>
+        </w:rPr>
+        <w:t>sửa</w:t>
+      </w:r>
+      <w:proofErr w:type="spellEnd"/>
+      <w:proofErr w:type="gramEnd"/>
+      <w:r>
+        <w:rPr>
+          <w:highlight w:val="yellow"/>
+        </w:rPr>
+        <w:t xml:space="preserve"> </w:t>
+      </w:r>
+      <w:proofErr w:type="spellStart"/>
+      <w:r>
+        <w:rPr>
+          <w:highlight w:val="yellow"/>
+        </w:rPr>
+        <w:t>nội</w:t>
+      </w:r>
+      <w:proofErr w:type="spellEnd"/>
+      <w:r>
+        <w:rPr>
+          <w:highlight w:val="yellow"/>
+        </w:rPr>
+        <w:t xml:space="preserve"> dung </w:t>
+      </w:r>
+      <w:proofErr w:type="spellStart"/>
+      <w:r>
+        <w:rPr>
+          <w:highlight w:val="yellow"/>
+        </w:rPr>
+        <w:t>fileA</w:t>
+      </w:r>
+      <w:proofErr w:type="spellEnd"/>
     </w:p>
     <w:p>
       <w:pPr>

</xml_diff>